<commit_message>
envié la propuesta al congreso
</commit_message>
<xml_diff>
--- a/1_estrategia_comunicacion/3_humanos_xxi/Carta de envio_marco_cañas.docx
+++ b/1_estrategia_comunicacion/3_humanos_xxi/Carta de envio_marco_cañas.docx
@@ -37,7 +37,7 @@
                     <pic:cNvPicPr/>
                   </pic:nvPicPr>
                   <pic:blipFill>
-                    <a:blip r:embed="rId5" cstate="print">
+                    <a:blip r:embed="rId6" cstate="print">
                       <a:extLst>
                         <a:ext uri="{28A0092B-C50C-407E-A947-70E740481C1C}">
                           <a14:useLocalDpi xmlns:a14="http://schemas.microsoft.com/office/drawing/2010/main" val="0"/>
@@ -291,16 +291,16 @@
         <w:tblLook w:val="04A0" w:firstRow="1" w:lastRow="0" w:firstColumn="1" w:lastColumn="0" w:noHBand="0" w:noVBand="1"/>
       </w:tblPr>
       <w:tblGrid>
-        <w:gridCol w:w="2822"/>
+        <w:gridCol w:w="2821"/>
         <w:gridCol w:w="1107"/>
-        <w:gridCol w:w="422"/>
+        <w:gridCol w:w="423"/>
         <w:gridCol w:w="639"/>
         <w:gridCol w:w="4986"/>
       </w:tblGrid>
       <w:tr>
         <w:tc>
           <w:tcPr>
-            <w:tcW w:w="2837" w:type="dxa"/>
+            <w:tcW w:w="2821" w:type="dxa"/>
             <w:hideMark/>
           </w:tcPr>
           <w:p>
@@ -343,7 +343,7 @@
         </w:tc>
         <w:tc>
           <w:tcPr>
-            <w:tcW w:w="7110" w:type="dxa"/>
+            <w:tcW w:w="7155" w:type="dxa"/>
             <w:gridSpan w:val="4"/>
             <w:shd w:val="clear" w:color="auto" w:fill="D9D9D9" w:themeFill="background1" w:themeFillShade="D9"/>
           </w:tcPr>
@@ -402,22 +402,22 @@
       <w:tr>
         <w:tc>
           <w:tcPr>
-            <w:tcW w:w="2837" w:type="dxa"/>
-          </w:tcPr>
-          <w:p>
-            <w:pPr>
-              <w:rPr>
-                <w:rFonts w:ascii="Open Sans" w:hAnsi="Open Sans" w:cs="Open Sans"/>
-                <w:iCs/>
-                <w:sz w:val="20"/>
-                <w:szCs w:val="20"/>
-              </w:rPr>
-            </w:pPr>
-          </w:p>
-        </w:tc>
-        <w:tc>
-          <w:tcPr>
-            <w:tcW w:w="7110" w:type="dxa"/>
+            <w:tcW w:w="2821" w:type="dxa"/>
+          </w:tcPr>
+          <w:p>
+            <w:pPr>
+              <w:rPr>
+                <w:rFonts w:ascii="Open Sans" w:hAnsi="Open Sans" w:cs="Open Sans"/>
+                <w:iCs/>
+                <w:sz w:val="20"/>
+                <w:szCs w:val="20"/>
+              </w:rPr>
+            </w:pPr>
+          </w:p>
+        </w:tc>
+        <w:tc>
+          <w:tcPr>
+            <w:tcW w:w="7155" w:type="dxa"/>
             <w:gridSpan w:val="4"/>
             <w:shd w:val="clear" w:color="auto" w:fill="D9D9D9" w:themeFill="background1" w:themeFillShade="D9"/>
           </w:tcPr>
@@ -436,7 +436,7 @@
       <w:tr>
         <w:tc>
           <w:tcPr>
-            <w:tcW w:w="2837" w:type="dxa"/>
+            <w:tcW w:w="2821" w:type="dxa"/>
             <w:vAlign w:val="center"/>
             <w:hideMark/>
           </w:tcPr>
@@ -471,7 +471,7 @@
         </w:tc>
         <w:tc>
           <w:tcPr>
-            <w:tcW w:w="7110" w:type="dxa"/>
+            <w:tcW w:w="7155" w:type="dxa"/>
             <w:gridSpan w:val="4"/>
             <w:shd w:val="clear" w:color="auto" w:fill="D9D9D9" w:themeFill="background1" w:themeFillShade="D9"/>
             <w:hideMark/>
@@ -492,15 +492,26 @@
                 <w:sz w:val="20"/>
                 <w:szCs w:val="20"/>
               </w:rPr>
-              <w:t>Marco Julio Cañas Campilo</w:t>
-            </w:r>
+              <w:t xml:space="preserve">Marco Julio Cañas </w:t>
+            </w:r>
+            <w:proofErr w:type="spellStart"/>
+            <w:r>
+              <w:rPr>
+                <w:rFonts w:ascii="Open Sans" w:hAnsi="Open Sans" w:cs="Open Sans"/>
+                <w:iCs/>
+                <w:sz w:val="20"/>
+                <w:szCs w:val="20"/>
+              </w:rPr>
+              <w:t>Campilo</w:t>
+            </w:r>
+            <w:proofErr w:type="spellEnd"/>
           </w:p>
         </w:tc>
       </w:tr>
       <w:tr>
         <w:tc>
           <w:tcPr>
-            <w:tcW w:w="2837" w:type="dxa"/>
+            <w:tcW w:w="2821" w:type="dxa"/>
             <w:vAlign w:val="center"/>
           </w:tcPr>
           <w:p>
@@ -525,7 +536,7 @@
         </w:tc>
         <w:tc>
           <w:tcPr>
-            <w:tcW w:w="7110" w:type="dxa"/>
+            <w:tcW w:w="7155" w:type="dxa"/>
             <w:gridSpan w:val="4"/>
             <w:shd w:val="clear" w:color="auto" w:fill="D9D9D9" w:themeFill="background1" w:themeFillShade="D9"/>
             <w:hideMark/>
@@ -539,13 +550,22 @@
                 <w:szCs w:val="20"/>
               </w:rPr>
             </w:pPr>
+            <w:r>
+              <w:rPr>
+                <w:rFonts w:ascii="Open Sans" w:hAnsi="Open Sans" w:cs="Open Sans"/>
+                <w:iCs/>
+                <w:sz w:val="20"/>
+                <w:szCs w:val="20"/>
+              </w:rPr>
+              <w:t>marco.canas@udea.edu.co</w:t>
+            </w:r>
           </w:p>
         </w:tc>
       </w:tr>
       <w:tr>
         <w:tc>
           <w:tcPr>
-            <w:tcW w:w="2837" w:type="dxa"/>
+            <w:tcW w:w="2821" w:type="dxa"/>
             <w:vAlign w:val="center"/>
           </w:tcPr>
           <w:p>
@@ -570,7 +590,7 @@
         </w:tc>
         <w:tc>
           <w:tcPr>
-            <w:tcW w:w="7110" w:type="dxa"/>
+            <w:tcW w:w="7155" w:type="dxa"/>
             <w:gridSpan w:val="4"/>
             <w:shd w:val="clear" w:color="auto" w:fill="D9D9D9" w:themeFill="background1" w:themeFillShade="D9"/>
           </w:tcPr>
@@ -583,13 +603,22 @@
                 <w:szCs w:val="20"/>
               </w:rPr>
             </w:pPr>
+            <w:r>
+              <w:rPr>
+                <w:rFonts w:ascii="Open Sans" w:hAnsi="Open Sans" w:cs="Open Sans"/>
+                <w:iCs/>
+                <w:sz w:val="20"/>
+                <w:szCs w:val="20"/>
+              </w:rPr>
+              <w:t>aldevaran@udea.edu.co</w:t>
+            </w:r>
           </w:p>
         </w:tc>
       </w:tr>
       <w:tr>
         <w:tc>
           <w:tcPr>
-            <w:tcW w:w="2837" w:type="dxa"/>
+            <w:tcW w:w="2821" w:type="dxa"/>
             <w:vAlign w:val="center"/>
           </w:tcPr>
           <w:p>
@@ -614,7 +643,7 @@
         </w:tc>
         <w:tc>
           <w:tcPr>
-            <w:tcW w:w="7110" w:type="dxa"/>
+            <w:tcW w:w="7155" w:type="dxa"/>
             <w:gridSpan w:val="4"/>
             <w:shd w:val="clear" w:color="auto" w:fill="D9D9D9" w:themeFill="background1" w:themeFillShade="D9"/>
             <w:hideMark/>
@@ -628,13 +657,22 @@
                 <w:szCs w:val="20"/>
               </w:rPr>
             </w:pPr>
+            <w:r>
+              <w:rPr>
+                <w:rFonts w:ascii="Open Sans" w:hAnsi="Open Sans" w:cs="Open Sans"/>
+                <w:iCs/>
+                <w:sz w:val="20"/>
+                <w:szCs w:val="20"/>
+              </w:rPr>
+              <w:t>Universidad de Antioquia--Colombia</w:t>
+            </w:r>
           </w:p>
         </w:tc>
       </w:tr>
       <w:tr>
         <w:tc>
           <w:tcPr>
-            <w:tcW w:w="2837" w:type="dxa"/>
+            <w:tcW w:w="2821" w:type="dxa"/>
             <w:vAlign w:val="center"/>
           </w:tcPr>
           <w:p>
@@ -659,7 +697,7 @@
         </w:tc>
         <w:tc>
           <w:tcPr>
-            <w:tcW w:w="7110" w:type="dxa"/>
+            <w:tcW w:w="7155" w:type="dxa"/>
             <w:gridSpan w:val="4"/>
             <w:shd w:val="clear" w:color="auto" w:fill="D9D9D9" w:themeFill="background1" w:themeFillShade="D9"/>
             <w:vAlign w:val="center"/>
@@ -673,29 +711,49 @@
                 <w:szCs w:val="20"/>
               </w:rPr>
             </w:pPr>
+            <w:r>
+              <w:rPr>
+                <w:rFonts w:ascii="Open Sans" w:hAnsi="Open Sans" w:cs="Open Sans"/>
+                <w:iCs/>
+                <w:sz w:val="20"/>
+                <w:szCs w:val="20"/>
+              </w:rPr>
+              <w:t xml:space="preserve">Licenciado en Matemáticas y Física, Magister en Ciencias Matemáticas, Tecnólogo en </w:t>
+            </w:r>
+            <w:proofErr w:type="spellStart"/>
+            <w:r>
+              <w:rPr>
+                <w:rFonts w:ascii="Open Sans" w:hAnsi="Open Sans" w:cs="Open Sans"/>
+                <w:iCs/>
+                <w:sz w:val="20"/>
+                <w:szCs w:val="20"/>
+              </w:rPr>
+              <w:t>Electrica</w:t>
+            </w:r>
+            <w:proofErr w:type="spellEnd"/>
           </w:p>
         </w:tc>
       </w:tr>
       <w:tr>
         <w:tc>
           <w:tcPr>
-            <w:tcW w:w="2837" w:type="dxa"/>
-            <w:vAlign w:val="center"/>
-          </w:tcPr>
-          <w:p>
-            <w:pPr>
-              <w:rPr>
-                <w:rFonts w:ascii="Open Sans" w:hAnsi="Open Sans" w:cs="Open Sans"/>
-                <w:iCs/>
-                <w:sz w:val="20"/>
-                <w:szCs w:val="20"/>
-              </w:rPr>
-            </w:pPr>
-          </w:p>
-        </w:tc>
-        <w:tc>
-          <w:tcPr>
-            <w:tcW w:w="7110" w:type="dxa"/>
+            <w:tcW w:w="2821" w:type="dxa"/>
+            <w:vAlign w:val="center"/>
+          </w:tcPr>
+          <w:p>
+            <w:pPr>
+              <w:rPr>
+                <w:rFonts w:ascii="Open Sans" w:hAnsi="Open Sans" w:cs="Open Sans"/>
+                <w:iCs/>
+                <w:sz w:val="20"/>
+                <w:szCs w:val="20"/>
+              </w:rPr>
+            </w:pPr>
+          </w:p>
+        </w:tc>
+        <w:tc>
+          <w:tcPr>
+            <w:tcW w:w="7155" w:type="dxa"/>
             <w:gridSpan w:val="4"/>
             <w:shd w:val="clear" w:color="auto" w:fill="D9D9D9" w:themeFill="background1" w:themeFillShade="D9"/>
             <w:vAlign w:val="center"/>
@@ -715,7 +773,7 @@
       <w:tr>
         <w:tc>
           <w:tcPr>
-            <w:tcW w:w="9947" w:type="dxa"/>
+            <w:tcW w:w="9976" w:type="dxa"/>
             <w:gridSpan w:val="5"/>
             <w:hideMark/>
           </w:tcPr>
@@ -734,549 +792,53 @@
       <w:tr>
         <w:tc>
           <w:tcPr>
-            <w:tcW w:w="2837" w:type="dxa"/>
-            <w:vAlign w:val="center"/>
-            <w:hideMark/>
-          </w:tcPr>
-          <w:p>
-            <w:pPr>
-              <w:rPr>
-                <w:rFonts w:ascii="Open Sans" w:hAnsi="Open Sans" w:cs="Open Sans"/>
-                <w:iCs/>
-                <w:sz w:val="20"/>
-                <w:szCs w:val="20"/>
-              </w:rPr>
-            </w:pPr>
-            <w:r>
-              <w:rPr>
-                <w:rFonts w:ascii="Open Sans" w:hAnsi="Open Sans" w:cs="Open Sans"/>
-                <w:iCs/>
-                <w:sz w:val="20"/>
-                <w:szCs w:val="20"/>
-              </w:rPr>
-              <w:t>Autor 2</w:t>
-            </w:r>
-          </w:p>
-        </w:tc>
-        <w:tc>
-          <w:tcPr>
-            <w:tcW w:w="7110" w:type="dxa"/>
+            <w:tcW w:w="2821" w:type="dxa"/>
+            <w:vAlign w:val="center"/>
+          </w:tcPr>
+          <w:p>
+            <w:pPr>
+              <w:rPr>
+                <w:rFonts w:ascii="Open Sans" w:hAnsi="Open Sans" w:cs="Open Sans"/>
+                <w:iCs/>
+                <w:sz w:val="20"/>
+                <w:szCs w:val="20"/>
+              </w:rPr>
+            </w:pPr>
+            <w:r>
+              <w:rPr>
+                <w:rFonts w:ascii="Open Sans" w:hAnsi="Open Sans" w:cs="Open Sans"/>
+                <w:iCs/>
+                <w:sz w:val="20"/>
+                <w:szCs w:val="20"/>
+              </w:rPr>
+              <w:t>Autor que hará la ponencia</w:t>
+            </w:r>
+          </w:p>
+        </w:tc>
+        <w:tc>
+          <w:tcPr>
+            <w:tcW w:w="7155" w:type="dxa"/>
             <w:gridSpan w:val="4"/>
             <w:shd w:val="clear" w:color="auto" w:fill="D9D9D9" w:themeFill="background1" w:themeFillShade="D9"/>
-            <w:hideMark/>
-          </w:tcPr>
-          <w:p>
-            <w:pPr>
-              <w:rPr>
-                <w:rFonts w:ascii="Open Sans" w:hAnsi="Open Sans" w:cs="Open Sans"/>
-                <w:iCs/>
-                <w:sz w:val="20"/>
-                <w:szCs w:val="20"/>
-              </w:rPr>
-            </w:pPr>
-          </w:p>
-        </w:tc>
-      </w:tr>
-      <w:tr>
-        <w:tc>
-          <w:tcPr>
-            <w:tcW w:w="2837" w:type="dxa"/>
-            <w:vAlign w:val="center"/>
-            <w:hideMark/>
-          </w:tcPr>
-          <w:p>
-            <w:pPr>
-              <w:rPr>
-                <w:rFonts w:ascii="Open Sans" w:hAnsi="Open Sans" w:cs="Open Sans"/>
-                <w:iCs/>
-                <w:sz w:val="20"/>
-                <w:szCs w:val="20"/>
-              </w:rPr>
-            </w:pPr>
-            <w:r>
-              <w:rPr>
-                <w:rFonts w:ascii="Open Sans" w:hAnsi="Open Sans" w:cs="Open Sans"/>
-                <w:iCs/>
-                <w:sz w:val="20"/>
-                <w:szCs w:val="20"/>
-              </w:rPr>
-              <w:t>Correo institucional</w:t>
-            </w:r>
-          </w:p>
-        </w:tc>
-        <w:tc>
-          <w:tcPr>
-            <w:tcW w:w="7110" w:type="dxa"/>
-            <w:gridSpan w:val="4"/>
-            <w:shd w:val="clear" w:color="auto" w:fill="D9D9D9" w:themeFill="background1" w:themeFillShade="D9"/>
-            <w:hideMark/>
-          </w:tcPr>
-          <w:p>
-            <w:pPr>
-              <w:rPr>
-                <w:rFonts w:ascii="Open Sans" w:hAnsi="Open Sans" w:cs="Open Sans"/>
-                <w:iCs/>
-                <w:sz w:val="20"/>
-                <w:szCs w:val="20"/>
-              </w:rPr>
-            </w:pPr>
-          </w:p>
-        </w:tc>
-      </w:tr>
-      <w:tr>
-        <w:tc>
-          <w:tcPr>
-            <w:tcW w:w="2837" w:type="dxa"/>
-            <w:vAlign w:val="center"/>
-            <w:hideMark/>
-          </w:tcPr>
-          <w:p>
-            <w:pPr>
-              <w:rPr>
-                <w:rFonts w:ascii="Open Sans" w:hAnsi="Open Sans" w:cs="Open Sans"/>
-                <w:iCs/>
-                <w:sz w:val="20"/>
-                <w:szCs w:val="20"/>
-              </w:rPr>
-            </w:pPr>
-            <w:r>
-              <w:rPr>
-                <w:rFonts w:ascii="Open Sans" w:hAnsi="Open Sans" w:cs="Open Sans"/>
-                <w:iCs/>
-                <w:sz w:val="20"/>
-                <w:szCs w:val="20"/>
-              </w:rPr>
-              <w:t>Correo personal</w:t>
-            </w:r>
-          </w:p>
-        </w:tc>
-        <w:tc>
-          <w:tcPr>
-            <w:tcW w:w="7110" w:type="dxa"/>
-            <w:gridSpan w:val="4"/>
-            <w:shd w:val="clear" w:color="auto" w:fill="D9D9D9" w:themeFill="background1" w:themeFillShade="D9"/>
-            <w:hideMark/>
-          </w:tcPr>
-          <w:p>
-            <w:pPr>
-              <w:rPr>
-                <w:rFonts w:ascii="Open Sans" w:hAnsi="Open Sans" w:cs="Open Sans"/>
-                <w:iCs/>
-                <w:sz w:val="20"/>
-                <w:szCs w:val="20"/>
-              </w:rPr>
-            </w:pPr>
-          </w:p>
-        </w:tc>
-      </w:tr>
-      <w:tr>
-        <w:tc>
-          <w:tcPr>
-            <w:tcW w:w="2837" w:type="dxa"/>
-            <w:vAlign w:val="center"/>
-          </w:tcPr>
-          <w:p>
-            <w:pPr>
-              <w:rPr>
-                <w:rFonts w:ascii="Open Sans" w:hAnsi="Open Sans" w:cs="Open Sans"/>
-                <w:iCs/>
-                <w:sz w:val="20"/>
-                <w:szCs w:val="20"/>
-              </w:rPr>
-            </w:pPr>
-            <w:r>
-              <w:rPr>
-                <w:rFonts w:ascii="Open Sans" w:hAnsi="Open Sans" w:cs="Open Sans"/>
-                <w:iCs/>
-                <w:sz w:val="20"/>
-                <w:szCs w:val="20"/>
-              </w:rPr>
-              <w:t>Institución - País</w:t>
-            </w:r>
-          </w:p>
-        </w:tc>
-        <w:tc>
-          <w:tcPr>
-            <w:tcW w:w="7110" w:type="dxa"/>
-            <w:gridSpan w:val="4"/>
-            <w:shd w:val="clear" w:color="auto" w:fill="D9D9D9" w:themeFill="background1" w:themeFillShade="D9"/>
-          </w:tcPr>
-          <w:p>
-            <w:pPr>
-              <w:rPr>
-                <w:rFonts w:ascii="Open Sans" w:hAnsi="Open Sans" w:cs="Open Sans"/>
-                <w:iCs/>
-                <w:sz w:val="20"/>
-                <w:szCs w:val="20"/>
-              </w:rPr>
-            </w:pPr>
-          </w:p>
-        </w:tc>
-      </w:tr>
-      <w:tr>
-        <w:tc>
-          <w:tcPr>
-            <w:tcW w:w="2837" w:type="dxa"/>
-            <w:vAlign w:val="center"/>
-          </w:tcPr>
-          <w:p>
-            <w:pPr>
-              <w:rPr>
-                <w:rFonts w:ascii="Open Sans" w:hAnsi="Open Sans" w:cs="Open Sans"/>
-                <w:iCs/>
-                <w:sz w:val="20"/>
-                <w:szCs w:val="20"/>
-              </w:rPr>
-            </w:pPr>
-            <w:r>
-              <w:rPr>
-                <w:rFonts w:ascii="Open Sans" w:hAnsi="Open Sans" w:cs="Open Sans"/>
-                <w:iCs/>
-                <w:sz w:val="20"/>
-                <w:szCs w:val="20"/>
-              </w:rPr>
-              <w:t>Títulos obtenidos</w:t>
-            </w:r>
-          </w:p>
-        </w:tc>
-        <w:tc>
-          <w:tcPr>
-            <w:tcW w:w="7110" w:type="dxa"/>
-            <w:gridSpan w:val="4"/>
-            <w:shd w:val="clear" w:color="auto" w:fill="D9D9D9" w:themeFill="background1" w:themeFillShade="D9"/>
-          </w:tcPr>
-          <w:p>
-            <w:pPr>
-              <w:rPr>
-                <w:rFonts w:ascii="Open Sans" w:hAnsi="Open Sans" w:cs="Open Sans"/>
-                <w:iCs/>
-                <w:sz w:val="20"/>
-                <w:szCs w:val="20"/>
-              </w:rPr>
-            </w:pPr>
-          </w:p>
-        </w:tc>
-      </w:tr>
-      <w:tr>
-        <w:tc>
-          <w:tcPr>
-            <w:tcW w:w="9947" w:type="dxa"/>
-            <w:gridSpan w:val="5"/>
-            <w:vAlign w:val="center"/>
-          </w:tcPr>
-          <w:p>
-            <w:pPr>
-              <w:rPr>
-                <w:rFonts w:ascii="Open Sans" w:hAnsi="Open Sans" w:cs="Open Sans"/>
-                <w:iCs/>
-                <w:sz w:val="20"/>
-                <w:szCs w:val="20"/>
-              </w:rPr>
-            </w:pPr>
-          </w:p>
-        </w:tc>
-      </w:tr>
-      <w:tr>
-        <w:tc>
-          <w:tcPr>
-            <w:tcW w:w="2837" w:type="dxa"/>
-            <w:vAlign w:val="center"/>
-            <w:hideMark/>
-          </w:tcPr>
-          <w:p>
-            <w:pPr>
-              <w:rPr>
-                <w:rFonts w:ascii="Open Sans" w:hAnsi="Open Sans" w:cs="Open Sans"/>
-                <w:iCs/>
-                <w:sz w:val="20"/>
-                <w:szCs w:val="20"/>
-              </w:rPr>
-            </w:pPr>
-            <w:r>
-              <w:rPr>
-                <w:rFonts w:ascii="Open Sans" w:hAnsi="Open Sans" w:cs="Open Sans"/>
-                <w:iCs/>
-                <w:sz w:val="20"/>
-                <w:szCs w:val="20"/>
-              </w:rPr>
-              <w:t>Autor 3</w:t>
-            </w:r>
-          </w:p>
-        </w:tc>
-        <w:tc>
-          <w:tcPr>
-            <w:tcW w:w="7110" w:type="dxa"/>
-            <w:gridSpan w:val="4"/>
-            <w:shd w:val="clear" w:color="auto" w:fill="D9D9D9" w:themeFill="background1" w:themeFillShade="D9"/>
-            <w:hideMark/>
-          </w:tcPr>
-          <w:p>
-            <w:pPr>
-              <w:rPr>
-                <w:rFonts w:ascii="Open Sans" w:hAnsi="Open Sans" w:cs="Open Sans"/>
-                <w:iCs/>
-                <w:sz w:val="20"/>
-                <w:szCs w:val="20"/>
-              </w:rPr>
-            </w:pPr>
-          </w:p>
-        </w:tc>
-      </w:tr>
-      <w:tr>
-        <w:tc>
-          <w:tcPr>
-            <w:tcW w:w="2837" w:type="dxa"/>
-            <w:vAlign w:val="center"/>
-            <w:hideMark/>
-          </w:tcPr>
-          <w:p>
-            <w:pPr>
-              <w:rPr>
-                <w:rFonts w:ascii="Open Sans" w:hAnsi="Open Sans" w:cs="Open Sans"/>
-                <w:iCs/>
-                <w:sz w:val="20"/>
-                <w:szCs w:val="20"/>
-              </w:rPr>
-            </w:pPr>
-            <w:r>
-              <w:rPr>
-                <w:rFonts w:ascii="Open Sans" w:hAnsi="Open Sans" w:cs="Open Sans"/>
-                <w:iCs/>
-                <w:sz w:val="20"/>
-                <w:szCs w:val="20"/>
-              </w:rPr>
-              <w:t>Correo institucional</w:t>
-            </w:r>
-          </w:p>
-        </w:tc>
-        <w:tc>
-          <w:tcPr>
-            <w:tcW w:w="7110" w:type="dxa"/>
-            <w:gridSpan w:val="4"/>
-            <w:shd w:val="clear" w:color="auto" w:fill="D9D9D9" w:themeFill="background1" w:themeFillShade="D9"/>
-            <w:hideMark/>
-          </w:tcPr>
-          <w:p>
-            <w:pPr>
-              <w:rPr>
-                <w:rFonts w:ascii="Open Sans" w:hAnsi="Open Sans" w:cs="Open Sans"/>
-                <w:iCs/>
-                <w:sz w:val="20"/>
-                <w:szCs w:val="20"/>
-              </w:rPr>
-            </w:pPr>
-          </w:p>
-        </w:tc>
-      </w:tr>
-      <w:tr>
-        <w:tc>
-          <w:tcPr>
-            <w:tcW w:w="2837" w:type="dxa"/>
-            <w:vAlign w:val="center"/>
-          </w:tcPr>
-          <w:p>
-            <w:pPr>
-              <w:rPr>
-                <w:rFonts w:ascii="Open Sans" w:hAnsi="Open Sans" w:cs="Open Sans"/>
-                <w:iCs/>
-                <w:sz w:val="20"/>
-                <w:szCs w:val="20"/>
-              </w:rPr>
-            </w:pPr>
-            <w:r>
-              <w:rPr>
-                <w:rFonts w:ascii="Open Sans" w:hAnsi="Open Sans" w:cs="Open Sans"/>
-                <w:iCs/>
-                <w:sz w:val="20"/>
-                <w:szCs w:val="20"/>
-              </w:rPr>
-              <w:t>Correo personal</w:t>
-            </w:r>
-          </w:p>
-        </w:tc>
-        <w:tc>
-          <w:tcPr>
-            <w:tcW w:w="7110" w:type="dxa"/>
-            <w:gridSpan w:val="4"/>
-            <w:shd w:val="clear" w:color="auto" w:fill="D9D9D9" w:themeFill="background1" w:themeFillShade="D9"/>
-          </w:tcPr>
-          <w:p>
-            <w:pPr>
-              <w:rPr>
-                <w:rFonts w:ascii="Open Sans" w:hAnsi="Open Sans" w:cs="Open Sans"/>
-                <w:iCs/>
-                <w:sz w:val="20"/>
-                <w:szCs w:val="20"/>
-              </w:rPr>
-            </w:pPr>
-          </w:p>
-        </w:tc>
-      </w:tr>
-      <w:tr>
-        <w:tc>
-          <w:tcPr>
-            <w:tcW w:w="2837" w:type="dxa"/>
-            <w:vAlign w:val="center"/>
-          </w:tcPr>
-          <w:p>
-            <w:pPr>
-              <w:rPr>
-                <w:rFonts w:ascii="Open Sans" w:hAnsi="Open Sans" w:cs="Open Sans"/>
-                <w:iCs/>
-                <w:sz w:val="20"/>
-                <w:szCs w:val="20"/>
-              </w:rPr>
-            </w:pPr>
-            <w:r>
-              <w:rPr>
-                <w:rFonts w:ascii="Open Sans" w:hAnsi="Open Sans" w:cs="Open Sans"/>
-                <w:iCs/>
-                <w:sz w:val="20"/>
-                <w:szCs w:val="20"/>
-              </w:rPr>
-              <w:t>Institución - País</w:t>
-            </w:r>
-          </w:p>
-        </w:tc>
-        <w:tc>
-          <w:tcPr>
-            <w:tcW w:w="7110" w:type="dxa"/>
-            <w:gridSpan w:val="4"/>
-            <w:shd w:val="clear" w:color="auto" w:fill="D9D9D9" w:themeFill="background1" w:themeFillShade="D9"/>
-            <w:hideMark/>
-          </w:tcPr>
-          <w:p>
-            <w:pPr>
-              <w:rPr>
-                <w:rFonts w:ascii="Open Sans" w:hAnsi="Open Sans" w:cs="Open Sans"/>
-                <w:iCs/>
-                <w:sz w:val="20"/>
-                <w:szCs w:val="20"/>
-              </w:rPr>
-            </w:pPr>
-          </w:p>
-        </w:tc>
-      </w:tr>
-      <w:tr>
-        <w:tc>
-          <w:tcPr>
-            <w:tcW w:w="2837" w:type="dxa"/>
-            <w:vAlign w:val="center"/>
-          </w:tcPr>
-          <w:p>
-            <w:pPr>
-              <w:rPr>
-                <w:rFonts w:ascii="Open Sans" w:hAnsi="Open Sans" w:cs="Open Sans"/>
-                <w:iCs/>
-                <w:sz w:val="20"/>
-                <w:szCs w:val="20"/>
-              </w:rPr>
-            </w:pPr>
-            <w:r>
-              <w:rPr>
-                <w:rFonts w:ascii="Open Sans" w:hAnsi="Open Sans" w:cs="Open Sans"/>
-                <w:iCs/>
-                <w:sz w:val="20"/>
-                <w:szCs w:val="20"/>
-              </w:rPr>
-              <w:t>Títulos obtenidos</w:t>
-            </w:r>
-          </w:p>
-        </w:tc>
-        <w:tc>
-          <w:tcPr>
-            <w:tcW w:w="7110" w:type="dxa"/>
-            <w:gridSpan w:val="4"/>
-            <w:shd w:val="clear" w:color="auto" w:fill="D9D9D9" w:themeFill="background1" w:themeFillShade="D9"/>
-          </w:tcPr>
-          <w:p>
-            <w:pPr>
-              <w:rPr>
-                <w:rFonts w:ascii="Open Sans" w:hAnsi="Open Sans" w:cs="Open Sans"/>
-                <w:iCs/>
-                <w:sz w:val="20"/>
-                <w:szCs w:val="20"/>
-              </w:rPr>
-            </w:pPr>
-          </w:p>
-        </w:tc>
-      </w:tr>
-      <w:tr>
-        <w:trPr>
-          <w:trHeight w:val="495"/>
-        </w:trPr>
-        <w:tc>
-          <w:tcPr>
-            <w:tcW w:w="9947" w:type="dxa"/>
-            <w:gridSpan w:val="5"/>
-            <w:vAlign w:val="center"/>
-          </w:tcPr>
-          <w:p>
-            <w:pPr>
-              <w:rPr>
-                <w:rFonts w:ascii="Open Sans" w:hAnsi="Open Sans" w:cs="Open Sans"/>
-                <w:i/>
-                <w:iCs/>
-                <w:sz w:val="20"/>
-                <w:szCs w:val="20"/>
-                <w:highlight w:val="yellow"/>
-              </w:rPr>
-            </w:pPr>
-            <w:r>
-              <w:rPr>
-                <w:rFonts w:ascii="Open Sans" w:hAnsi="Open Sans" w:cs="Open Sans"/>
-                <w:i/>
-                <w:iCs/>
-                <w:sz w:val="20"/>
-                <w:szCs w:val="20"/>
-                <w:highlight w:val="yellow"/>
-              </w:rPr>
-              <w:t>Insertar más filas en caso de tener más autores</w:t>
-            </w:r>
-          </w:p>
-        </w:tc>
-      </w:tr>
-      <w:tr>
-        <w:tc>
-          <w:tcPr>
-            <w:tcW w:w="2837" w:type="dxa"/>
-            <w:vAlign w:val="center"/>
-          </w:tcPr>
-          <w:p>
-            <w:pPr>
-              <w:rPr>
-                <w:rFonts w:ascii="Open Sans" w:hAnsi="Open Sans" w:cs="Open Sans"/>
-                <w:iCs/>
-                <w:sz w:val="20"/>
-                <w:szCs w:val="20"/>
-              </w:rPr>
-            </w:pPr>
-            <w:r>
-              <w:rPr>
-                <w:rFonts w:ascii="Open Sans" w:hAnsi="Open Sans" w:cs="Open Sans"/>
-                <w:iCs/>
-                <w:sz w:val="20"/>
-                <w:szCs w:val="20"/>
-              </w:rPr>
-              <w:t>Autor que hará la ponencia</w:t>
-            </w:r>
-          </w:p>
-        </w:tc>
-        <w:tc>
-          <w:tcPr>
-            <w:tcW w:w="7110" w:type="dxa"/>
-            <w:gridSpan w:val="4"/>
-            <w:shd w:val="clear" w:color="auto" w:fill="D9D9D9" w:themeFill="background1" w:themeFillShade="D9"/>
-          </w:tcPr>
-          <w:p>
-            <w:pPr>
-              <w:rPr>
-                <w:rFonts w:ascii="Open Sans" w:hAnsi="Open Sans" w:cs="Open Sans"/>
-                <w:iCs/>
-                <w:sz w:val="20"/>
-                <w:szCs w:val="20"/>
-              </w:rPr>
-            </w:pPr>
+          </w:tcPr>
+          <w:p>
+            <w:pPr>
+              <w:rPr>
+                <w:rFonts w:ascii="Open Sans" w:hAnsi="Open Sans" w:cs="Open Sans"/>
+                <w:iCs/>
+                <w:sz w:val="20"/>
+                <w:szCs w:val="20"/>
+              </w:rPr>
+            </w:pPr>
+            <w:r>
+              <w:rPr>
+                <w:rFonts w:ascii="Open Sans" w:hAnsi="Open Sans" w:cs="Open Sans"/>
+                <w:iCs/>
+                <w:sz w:val="20"/>
+                <w:szCs w:val="20"/>
+              </w:rPr>
+              <w:t>Marco Julio Cañas Campillo</w:t>
+            </w:r>
           </w:p>
         </w:tc>
       </w:tr>
@@ -1286,7 +848,7 @@
         </w:trPr>
         <w:tc>
           <w:tcPr>
-            <w:tcW w:w="9947" w:type="dxa"/>
+            <w:tcW w:w="9976" w:type="dxa"/>
             <w:gridSpan w:val="5"/>
             <w:vAlign w:val="center"/>
           </w:tcPr>
@@ -1340,7 +902,7 @@
       <w:tr>
         <w:tc>
           <w:tcPr>
-            <w:tcW w:w="2837" w:type="dxa"/>
+            <w:tcW w:w="2821" w:type="dxa"/>
             <w:vMerge w:val="restart"/>
             <w:vAlign w:val="center"/>
           </w:tcPr>
@@ -1375,7 +937,7 @@
         </w:tc>
         <w:tc>
           <w:tcPr>
-            <w:tcW w:w="993" w:type="dxa"/>
+            <w:tcW w:w="1107" w:type="dxa"/>
             <w:vAlign w:val="center"/>
           </w:tcPr>
           <w:p>
@@ -1400,7 +962,7 @@
         </w:tc>
         <w:tc>
           <w:tcPr>
-            <w:tcW w:w="425" w:type="dxa"/>
+            <w:tcW w:w="423" w:type="dxa"/>
             <w:shd w:val="clear" w:color="auto" w:fill="D9D9D9" w:themeFill="background1" w:themeFillShade="D9"/>
             <w:vAlign w:val="center"/>
           </w:tcPr>
@@ -1444,7 +1006,7 @@
         </w:tc>
         <w:tc>
           <w:tcPr>
-            <w:tcW w:w="5053" w:type="dxa"/>
+            <w:tcW w:w="4986" w:type="dxa"/>
             <w:shd w:val="clear" w:color="auto" w:fill="D9D9D9" w:themeFill="background1" w:themeFillShade="D9"/>
             <w:vAlign w:val="center"/>
           </w:tcPr>
@@ -1464,7 +1026,7 @@
       <w:tr>
         <w:tc>
           <w:tcPr>
-            <w:tcW w:w="2837" w:type="dxa"/>
+            <w:tcW w:w="2821" w:type="dxa"/>
             <w:vMerge/>
             <w:vAlign w:val="center"/>
             <w:hideMark/>
@@ -1482,7 +1044,7 @@
         </w:tc>
         <w:tc>
           <w:tcPr>
-            <w:tcW w:w="993" w:type="dxa"/>
+            <w:tcW w:w="1107" w:type="dxa"/>
             <w:vAlign w:val="center"/>
           </w:tcPr>
           <w:p>
@@ -1507,7 +1069,7 @@
         </w:tc>
         <w:tc>
           <w:tcPr>
-            <w:tcW w:w="425" w:type="dxa"/>
+            <w:tcW w:w="423" w:type="dxa"/>
             <w:shd w:val="clear" w:color="auto" w:fill="D9D9D9" w:themeFill="background1" w:themeFillShade="D9"/>
             <w:vAlign w:val="center"/>
           </w:tcPr>
@@ -1522,6 +1084,14 @@
                 <w:szCs w:val="20"/>
               </w:rPr>
             </w:pPr>
+            <w:r>
+              <w:rPr>
+                <w:rFonts w:ascii="Open Sans" w:eastAsia="Times New Roman" w:hAnsi="Open Sans" w:cs="Open Sans"/>
+                <w:sz w:val="20"/>
+                <w:szCs w:val="20"/>
+              </w:rPr>
+              <w:t>x</w:t>
+            </w:r>
           </w:p>
         </w:tc>
         <w:tc>
@@ -1551,7 +1121,7 @@
         </w:tc>
         <w:tc>
           <w:tcPr>
-            <w:tcW w:w="5053" w:type="dxa"/>
+            <w:tcW w:w="4986" w:type="dxa"/>
             <w:shd w:val="clear" w:color="auto" w:fill="D9D9D9" w:themeFill="background1" w:themeFillShade="D9"/>
             <w:vAlign w:val="center"/>
           </w:tcPr>
@@ -1563,15 +1133,25 @@
                 <w:rFonts w:ascii="Open Sans" w:eastAsia="Times New Roman" w:hAnsi="Open Sans" w:cs="Open Sans"/>
                 <w:sz w:val="20"/>
                 <w:szCs w:val="20"/>
-              </w:rPr>
-            </w:pPr>
+                <w:u w:val="single"/>
+              </w:rPr>
+            </w:pPr>
+            <w:r>
+              <w:rPr>
+                <w:rFonts w:ascii="Open Sans" w:eastAsia="Times New Roman" w:hAnsi="Open Sans" w:cs="Open Sans"/>
+                <w:sz w:val="20"/>
+                <w:szCs w:val="20"/>
+                <w:u w:val="single"/>
+              </w:rPr>
+              <w:t>Revolución metodológica, Revolución didáctica, Revolución al modelo de enseñanza,</w:t>
+            </w:r>
           </w:p>
         </w:tc>
       </w:tr>
       <w:tr>
         <w:tc>
           <w:tcPr>
-            <w:tcW w:w="2837" w:type="dxa"/>
+            <w:tcW w:w="2821" w:type="dxa"/>
             <w:vMerge/>
             <w:vAlign w:val="center"/>
             <w:hideMark/>
@@ -1589,7 +1169,7 @@
         </w:tc>
         <w:tc>
           <w:tcPr>
-            <w:tcW w:w="993" w:type="dxa"/>
+            <w:tcW w:w="1107" w:type="dxa"/>
             <w:vAlign w:val="center"/>
           </w:tcPr>
           <w:p>
@@ -1614,7 +1194,7 @@
         </w:tc>
         <w:tc>
           <w:tcPr>
-            <w:tcW w:w="425" w:type="dxa"/>
+            <w:tcW w:w="423" w:type="dxa"/>
             <w:shd w:val="clear" w:color="auto" w:fill="D9D9D9" w:themeFill="background1" w:themeFillShade="D9"/>
             <w:vAlign w:val="center"/>
           </w:tcPr>
@@ -1658,7 +1238,7 @@
         </w:tc>
         <w:tc>
           <w:tcPr>
-            <w:tcW w:w="5053" w:type="dxa"/>
+            <w:tcW w:w="4986" w:type="dxa"/>
             <w:shd w:val="clear" w:color="auto" w:fill="D9D9D9" w:themeFill="background1" w:themeFillShade="D9"/>
             <w:vAlign w:val="center"/>
           </w:tcPr>
@@ -1810,6 +1390,15 @@
               </w:rPr>
               <w:t>Todos los autores leyeron y comprenden nuestro Código de Ética</w:t>
             </w:r>
+            <w:r>
+              <w:rPr>
+                <w:rFonts w:ascii="Open Sans" w:hAnsi="Open Sans" w:cs="Open Sans"/>
+                <w:iCs/>
+                <w:sz w:val="18"/>
+                <w:szCs w:val="18"/>
+              </w:rPr>
+              <w:t xml:space="preserve">: </w:t>
+            </w:r>
           </w:p>
         </w:tc>
         <w:tc>
@@ -1898,6 +1487,15 @@
                 <w:szCs w:val="18"/>
               </w:rPr>
               <w:t>Todos los autores participaron en la construcción y edición del trabajo</w:t>
+            </w:r>
+            <w:r>
+              <w:rPr>
+                <w:rFonts w:ascii="Open Sans" w:hAnsi="Open Sans" w:cs="Open Sans"/>
+                <w:iCs/>
+                <w:sz w:val="18"/>
+                <w:szCs w:val="18"/>
+              </w:rPr>
+              <w:t xml:space="preserve">: Aceptada. </w:t>
             </w:r>
           </w:p>
         </w:tc>
@@ -2314,6 +1912,15 @@
         </w:rPr>
         <w:t>Fecha:</w:t>
       </w:r>
+      <w:r>
+        <w:rPr>
+          <w:rFonts w:ascii="Open Sans" w:hAnsi="Open Sans" w:cs="Open Sans"/>
+          <w:iCs/>
+          <w:sz w:val="20"/>
+          <w:szCs w:val="20"/>
+        </w:rPr>
+        <w:t xml:space="preserve"> 10 de ago. de 25</w:t>
+      </w:r>
     </w:p>
     <w:p>
       <w:pPr>
@@ -2332,6 +1939,15 @@
           <w:szCs w:val="20"/>
         </w:rPr>
         <w:t>Ciudad/País:</w:t>
+      </w:r>
+      <w:r>
+        <w:rPr>
+          <w:rFonts w:ascii="Open Sans" w:hAnsi="Open Sans" w:cs="Open Sans"/>
+          <w:iCs/>
+          <w:sz w:val="20"/>
+          <w:szCs w:val="20"/>
+        </w:rPr>
+        <w:t xml:space="preserve"> Caucasia/Antioquia. </w:t>
       </w:r>
     </w:p>
     <w:p>
@@ -2352,6 +1968,7 @@
           <w:iCs/>
           <w:sz w:val="20"/>
           <w:szCs w:val="20"/>
+          <w:u w:val="single"/>
         </w:rPr>
       </w:pPr>
       <w:r>
@@ -2389,6 +2006,15 @@
           <w:szCs w:val="20"/>
         </w:rPr>
         <w:t>:</w:t>
+      </w:r>
+      <w:r>
+        <w:rPr>
+          <w:rFonts w:ascii="Open Sans" w:hAnsi="Open Sans" w:cs="Open Sans"/>
+          <w:iCs/>
+          <w:sz w:val="20"/>
+          <w:szCs w:val="20"/>
+        </w:rPr>
+        <w:t xml:space="preserve"> Marco Julio Cañas Campillo. </w:t>
       </w:r>
     </w:p>
     <w:sectPr>
@@ -3228,4 +2854,16 @@
     </a:ext>
   </a:extLst>
 </a:theme>
+</file>
+
+<file path=customXml/item1.xml><?xml version="1.0" encoding="utf-8"?>
+<b:Sources xmlns:b="http://schemas.openxmlformats.org/officeDocument/2006/bibliography" xmlns="http://schemas.openxmlformats.org/officeDocument/2006/bibliography" SelectedStyle="\APASixthEditionOfficeOnline.xsl" StyleName="APA" Version="6"/>
+</file>
+
+<file path=customXml/itemProps1.xml><?xml version="1.0" encoding="utf-8"?>
+<ds:datastoreItem xmlns:ds="http://schemas.openxmlformats.org/officeDocument/2006/customXml" ds:itemID="{71240A35-29AF-4504-91CE-F913172AC8D0}">
+  <ds:schemaRefs>
+    <ds:schemaRef ds:uri="http://schemas.openxmlformats.org/officeDocument/2006/bibliography"/>
+  </ds:schemaRefs>
+</ds:datastoreItem>
 </file>
</xml_diff>